<commit_message>
Deploying to gh-pages from @ Morrison-Lab/win@583f5e63bc3a3b4b51e16614648c043cf69b4b88 🚀
</commit_message>
<xml_diff>
--- a/chapters/01-introduction.docx
+++ b/chapters/01-introduction.docx
@@ -2370,10 +2370,12 @@
             <m:oMath>
               <m:r>
                 <m:rPr>
-                  <m:nor/>
                   <m:sty m:val="p"/>
                 </m:rPr>
                 <m:t>E</m:t>
+              </m:r>
+              <m:r>
+                <m:t>​</m:t>
               </m:r>
               <m:d>
                 <m:dPr>
@@ -2407,6 +2409,9 @@
                 </m:e>
               </m:d>
               <m:r>
+                <m:t>​</m:t>
+              </m:r>
+              <m:r>
                 <m:rPr>
                   <m:sty m:val="p"/>
                 </m:rPr>
@@ -2414,10 +2419,12 @@
               </m:r>
               <m:r>
                 <m:rPr>
-                  <m:nor/>
                   <m:sty m:val="p"/>
                 </m:rPr>
                 <m:t>E</m:t>
+              </m:r>
+              <m:r>
+                <m:t>​</m:t>
               </m:r>
               <m:d>
                 <m:dPr>
@@ -2450,6 +2457,9 @@
                   </m:sSup>
                 </m:e>
               </m:d>
+              <m:r>
+                <m:t>​</m:t>
+              </m:r>
             </m:oMath>
             <w:r>
               <w:t xml:space="preserve">, which also applies to nondichotomous outcomes.</w:t>
@@ -2502,10 +2512,12 @@
       <m:oMath>
         <m:r>
           <m:rPr>
-            <m:nor/>
             <m:sty m:val="p"/>
           </m:rPr>
           <m:t>E</m:t>
+        </m:r>
+        <m:r>
+          <m:t>​</m:t>
         </m:r>
         <m:d>
           <m:dPr>
@@ -2539,6 +2551,9 @@
           </m:e>
         </m:d>
         <m:r>
+          <m:t>​</m:t>
+        </m:r>
+        <m:r>
           <m:rPr>
             <m:sty m:val="p"/>
           </m:rPr>
@@ -2546,10 +2561,12 @@
         </m:r>
         <m:r>
           <m:rPr>
-            <m:nor/>
             <m:sty m:val="p"/>
           </m:rPr>
           <m:t>E</m:t>
+        </m:r>
+        <m:r>
+          <m:t>​</m:t>
         </m:r>
         <m:d>
           <m:dPr>
@@ -2582,6 +2599,9 @@
             </m:sSup>
           </m:e>
         </m:d>
+        <m:r>
+          <m:t>​</m:t>
+        </m:r>
       </m:oMath>
       <w:r>
         <w:t xml:space="preserve">,</w:t>
@@ -3062,10 +3082,12 @@
         <m:oMath>
           <m:r>
             <m:rPr>
-              <m:nor/>
               <m:sty m:val="p"/>
             </m:rPr>
             <m:t>E</m:t>
+          </m:r>
+          <m:r>
+            <m:t>​</m:t>
           </m:r>
           <m:d>
             <m:dPr>
@@ -3099,6 +3121,9 @@
             </m:e>
           </m:d>
           <m:r>
+            <m:t>​</m:t>
+          </m:r>
+          <m:r>
             <m:rPr>
               <m:sty m:val="p"/>
             </m:rPr>
@@ -3106,10 +3131,12 @@
           </m:r>
           <m:r>
             <m:rPr>
-              <m:nor/>
               <m:sty m:val="p"/>
             </m:rPr>
             <m:t>E</m:t>
+          </m:r>
+          <m:r>
+            <m:t>​</m:t>
           </m:r>
           <m:d>
             <m:dPr>
@@ -3143,6 +3170,9 @@
             </m:e>
           </m:d>
           <m:r>
+            <m:t>​</m:t>
+          </m:r>
+          <m:r>
             <m:rPr>
               <m:sty m:val="p"/>
             </m:rPr>
@@ -3150,10 +3180,12 @@
           </m:r>
           <m:r>
             <m:rPr>
-              <m:nor/>
               <m:sty m:val="p"/>
             </m:rPr>
             <m:t>E</m:t>
+          </m:r>
+          <m:r>
+            <m:t>​</m:t>
           </m:r>
           <m:d>
             <m:dPr>
@@ -3213,6 +3245,9 @@
               </m:sSup>
             </m:e>
           </m:d>
+          <m:r>
+            <m:t>​</m:t>
+          </m:r>
           <m:r>
             <m:rPr>
               <m:sty m:val="p"/>
@@ -3962,10 +3997,12 @@
             <m:oMath>
               <m:r>
                 <m:rPr>
-                  <m:nor/>
                   <m:sty m:val="p"/>
                 </m:rPr>
                 <m:t>E</m:t>
+              </m:r>
+              <m:r>
+                <m:t>​</m:t>
               </m:r>
               <m:d>
                 <m:dPr>
@@ -3989,6 +4026,9 @@
                   </m:sSup>
                 </m:e>
               </m:d>
+              <m:r>
+                <m:t>​</m:t>
+              </m:r>
             </m:oMath>
             <w:r>
               <w:t xml:space="preserve"> </w:t>
@@ -4025,10 +4065,12 @@
             <m:oMath>
               <m:r>
                 <m:rPr>
-                  <m:nor/>
                   <m:sty m:val="p"/>
                 </m:rPr>
                 <m:t>E</m:t>
+              </m:r>
+              <m:r>
+                <m:t>​</m:t>
               </m:r>
               <m:d>
                 <m:dPr>
@@ -4052,6 +4094,9 @@
                   </m:sSup>
                 </m:e>
               </m:d>
+              <m:r>
+                <m:t>​</m:t>
+              </m:r>
               <m:r>
                 <m:rPr>
                   <m:sty m:val="p"/>
@@ -4228,10 +4273,12 @@
             <m:oMath>
               <m:r>
                 <m:rPr>
-                  <m:nor/>
                   <m:sty m:val="p"/>
                 </m:rPr>
                 <m:t>E</m:t>
+              </m:r>
+              <m:r>
+                <m:t>​</m:t>
               </m:r>
               <m:d>
                 <m:dPr>
@@ -4256,6 +4303,9 @@
                 </m:e>
               </m:d>
               <m:r>
+                <m:t>​</m:t>
+              </m:r>
+              <m:r>
                 <m:rPr>
                   <m:sty m:val="p"/>
                 </m:rPr>
@@ -4322,10 +4372,12 @@
             <m:oMath>
               <m:r>
                 <m:rPr>
-                  <m:nor/>
                   <m:sty m:val="p"/>
                 </m:rPr>
                 <m:t>E</m:t>
+              </m:r>
+              <m:r>
+                <m:t>​</m:t>
               </m:r>
               <m:d>
                 <m:dPr>
@@ -4350,6 +4402,9 @@
                 </m:e>
               </m:d>
               <m:r>
+                <m:t>​</m:t>
+              </m:r>
+              <m:r>
                 <m:rPr>
                   <m:sty m:val="p"/>
                 </m:rPr>
@@ -4431,10 +4486,12 @@
             <m:oMath>
               <m:r>
                 <m:rPr>
-                  <m:nor/>
                   <m:sty m:val="p"/>
                 </m:rPr>
                 <m:t>E</m:t>
+              </m:r>
+              <m:r>
+                <m:t>​</m:t>
               </m:r>
               <m:d>
                 <m:dPr>
@@ -4458,6 +4515,9 @@
                   </m:sSup>
                 </m:e>
               </m:d>
+              <m:r>
+                <m:t>​</m:t>
+              </m:r>
               <m:r>
                 <m:rPr>
                   <m:sty m:val="p"/>
@@ -4585,10 +4645,12 @@
             <m:oMath>
               <m:r>
                 <m:rPr>
-                  <m:nor/>
                   <m:sty m:val="p"/>
                 </m:rPr>
                 <m:t>E</m:t>
+              </m:r>
+              <m:r>
+                <m:t>​</m:t>
               </m:r>
               <m:d>
                 <m:dPr>
@@ -4613,6 +4675,9 @@
                 </m:e>
               </m:d>
               <m:r>
+                <m:t>​</m:t>
+              </m:r>
+              <m:r>
                 <m:rPr>
                   <m:sty m:val="p"/>
                 </m:rPr>
@@ -4620,10 +4685,12 @@
               </m:r>
               <m:r>
                 <m:rPr>
-                  <m:nor/>
                   <m:sty m:val="p"/>
                 </m:rPr>
                 <m:t>E</m:t>
+              </m:r>
+              <m:r>
+                <m:t>​</m:t>
               </m:r>
               <m:d>
                 <m:dPr>
@@ -4659,6 +4726,9 @@
                   </m:sSup>
                 </m:e>
               </m:d>
+              <m:r>
+                <m:t>​</m:t>
+              </m:r>
             </m:oMath>
             <w:r>
               <w:t xml:space="preserve"> </w:t>
@@ -4784,10 +4854,12 @@
             <m:oMath>
               <m:r>
                 <m:rPr>
-                  <m:nor/>
                   <m:sty m:val="p"/>
                 </m:rPr>
                 <m:t>Var</m:t>
+              </m:r>
+              <m:r>
+                <m:t>​</m:t>
               </m:r>
               <m:d>
                 <m:dPr>
@@ -4821,6 +4893,9 @@
                 </m:e>
               </m:d>
               <m:r>
+                <m:t>​</m:t>
+              </m:r>
+              <m:r>
                 <m:rPr>
                   <m:sty m:val="p"/>
                 </m:rPr>
@@ -4828,10 +4903,12 @@
               </m:r>
               <m:r>
                 <m:rPr>
-                  <m:nor/>
                   <m:sty m:val="p"/>
                 </m:rPr>
                 <m:t>Var</m:t>
+              </m:r>
+              <m:r>
+                <m:t>​</m:t>
               </m:r>
               <m:d>
                 <m:dPr>
@@ -4865,6 +4942,9 @@
                 </m:e>
               </m:d>
               <m:r>
+                <m:t>​</m:t>
+              </m:r>
+              <m:r>
                 <m:rPr>
                   <m:sty m:val="p"/>
                 </m:rPr>
@@ -5028,10 +5108,12 @@
             <m:oMath>
               <m:r>
                 <m:rPr>
-                  <m:nor/>
                   <m:sty m:val="p"/>
                 </m:rPr>
                 <m:t>Var</m:t>
+              </m:r>
+              <m:r>
+                <m:t>​</m:t>
               </m:r>
               <m:d>
                 <m:dPr>
@@ -5065,6 +5147,9 @@
                 </m:e>
               </m:d>
               <m:r>
+                <m:t>​</m:t>
+              </m:r>
+              <m:r>
                 <m:rPr>
                   <m:sty m:val="p"/>
                 </m:rPr>
@@ -5072,10 +5157,12 @@
               </m:r>
               <m:r>
                 <m:rPr>
-                  <m:nor/>
                   <m:sty m:val="p"/>
                 </m:rPr>
                 <m:t>Var</m:t>
+              </m:r>
+              <m:r>
+                <m:t>​</m:t>
               </m:r>
               <m:d>
                 <m:dPr>
@@ -5108,6 +5195,9 @@
                   </m:sSup>
                 </m:e>
               </m:d>
+              <m:r>
+                <m:t>​</m:t>
+              </m:r>
             </m:oMath>
             <w:r>
               <w:t xml:space="preserve"> </w:t>
@@ -5121,10 +5211,12 @@
             <m:oMath>
               <m:r>
                 <m:rPr>
-                  <m:nor/>
                   <m:sty m:val="p"/>
                 </m:rPr>
                 <m:t>Var</m:t>
+              </m:r>
+              <m:r>
+                <m:t>​</m:t>
               </m:r>
               <m:d>
                 <m:dPr>
@@ -5184,6 +5276,9 @@
                   </m:sSup>
                 </m:e>
               </m:d>
+              <m:r>
+                <m:t>​</m:t>
+              </m:r>
             </m:oMath>
             <w:r>
               <w:t xml:space="preserve">, because the covariance of</w:t>
@@ -6892,35 +6987,44 @@
         <w:t xml:space="preserve"> </w:t>
       </w:r>
       <m:oMath>
-        <m:acc>
-          <m:accPr>
-            <m:chr m:val="̂"/>
-          </m:accPr>
+        <m:r>
+          <m:rPr>
+            <m:sty m:val="p"/>
+          </m:rPr>
+          <m:t/>
+        </m:r>
+        <m:r>
+          <m:t>​</m:t>
+        </m:r>
+        <m:d>
+          <m:dPr>
+            <m:begChr m:val="["/>
+            <m:sepChr m:val=""/>
+            <m:endChr m:val="]"/>
+            <m:grow/>
+          </m:dPr>
           <m:e>
-            <m:r>
-              <m:rPr>
-                <m:sty m:val="p"/>
-              </m:rPr>
-              <m:t>Pr</m:t>
-            </m:r>
-          </m:e>
-        </m:acc>
-        <m:r>
-          <m:rPr>
-            <m:sty m:val="p"/>
-          </m:rPr>
-          <m:t>[</m:t>
-        </m:r>
-        <m:sSup>
-          <m:e>
-            <m:r>
-              <m:t>Y</m:t>
-            </m:r>
-          </m:e>
-          <m:sup>
-            <m:r>
-              <m:t>a</m:t>
-            </m:r>
+            <m:sSup>
+              <m:e>
+                <m:r>
+                  <m:t>Y</m:t>
+                </m:r>
+              </m:e>
+              <m:sup>
+                <m:r>
+                  <m:t>a</m:t>
+                </m:r>
+                <m:r>
+                  <m:rPr>
+                    <m:sty m:val="p"/>
+                  </m:rPr>
+                  <m:t>=</m:t>
+                </m:r>
+                <m:r>
+                  <m:t>0</m:t>
+                </m:r>
+              </m:sup>
+            </m:sSup>
             <m:r>
               <m:rPr>
                 <m:sty m:val="p"/>
@@ -6928,24 +7032,12 @@
               <m:t>=</m:t>
             </m:r>
             <m:r>
-              <m:t>0</m:t>
-            </m:r>
-          </m:sup>
-        </m:sSup>
-        <m:r>
-          <m:rPr>
-            <m:sty m:val="p"/>
-          </m:rPr>
-          <m:t>=</m:t>
-        </m:r>
-        <m:r>
-          <m:t>1</m:t>
-        </m:r>
-        <m:r>
-          <m:rPr>
-            <m:sty m:val="p"/>
-          </m:rPr>
-          <m:t>]</m:t>
+              <m:t>1</m:t>
+            </m:r>
+          </m:e>
+        </m:d>
+        <m:r>
+          <m:t>​</m:t>
         </m:r>
         <m:r>
           <m:rPr>
@@ -7086,51 +7178,48 @@
         <w:t xml:space="preserve"> </w:t>
       </w:r>
       <m:oMath>
-        <m:acc>
-          <m:accPr>
-            <m:chr m:val="̂"/>
-          </m:accPr>
+        <m:r>
+          <m:rPr>
+            <m:sty m:val="p"/>
+          </m:rPr>
+          <m:t/>
+        </m:r>
+        <m:r>
+          <m:t>​</m:t>
+        </m:r>
+        <m:d>
+          <m:dPr>
+            <m:begChr m:val="["/>
+            <m:sepChr m:val=""/>
+            <m:endChr m:val="]"/>
+            <m:grow/>
+          </m:dPr>
           <m:e>
+            <m:sSup>
+              <m:e>
+                <m:r>
+                  <m:t>Y</m:t>
+                </m:r>
+              </m:e>
+              <m:sup>
+                <m:r>
+                  <m:t>a</m:t>
+                </m:r>
+              </m:sup>
+            </m:sSup>
             <m:r>
               <m:rPr>
                 <m:sty m:val="p"/>
               </m:rPr>
-              <m:t>Pr</m:t>
+              <m:t>=</m:t>
+            </m:r>
+            <m:r>
+              <m:t>1</m:t>
             </m:r>
           </m:e>
-        </m:acc>
-        <m:r>
-          <m:rPr>
-            <m:sty m:val="p"/>
-          </m:rPr>
-          <m:t>[</m:t>
-        </m:r>
-        <m:sSup>
-          <m:e>
-            <m:r>
-              <m:t>Y</m:t>
-            </m:r>
-          </m:e>
-          <m:sup>
-            <m:r>
-              <m:t>a</m:t>
-            </m:r>
-          </m:sup>
-        </m:sSup>
-        <m:r>
-          <m:rPr>
-            <m:sty m:val="p"/>
-          </m:rPr>
-          <m:t>=</m:t>
-        </m:r>
-        <m:r>
-          <m:t>1</m:t>
-        </m:r>
-        <m:r>
-          <m:rPr>
-            <m:sty m:val="p"/>
-          </m:rPr>
-          <m:t>]</m:t>
+        </m:d>
+        <m:r>
+          <m:t>​</m:t>
         </m:r>
       </m:oMath>
       <w:r>
@@ -7330,51 +7419,48 @@
         <w:pStyle w:val="BodyText"/>
       </w:pPr>
       <m:oMath>
-        <m:acc>
-          <m:accPr>
-            <m:chr m:val="̂"/>
-          </m:accPr>
+        <m:r>
+          <m:rPr>
+            <m:sty m:val="p"/>
+          </m:rPr>
+          <m:t/>
+        </m:r>
+        <m:r>
+          <m:t>​</m:t>
+        </m:r>
+        <m:d>
+          <m:dPr>
+            <m:begChr m:val="["/>
+            <m:sepChr m:val=""/>
+            <m:endChr m:val="]"/>
+            <m:grow/>
+          </m:dPr>
           <m:e>
+            <m:sSup>
+              <m:e>
+                <m:r>
+                  <m:t>Y</m:t>
+                </m:r>
+              </m:e>
+              <m:sup>
+                <m:r>
+                  <m:t>a</m:t>
+                </m:r>
+              </m:sup>
+            </m:sSup>
             <m:r>
               <m:rPr>
                 <m:sty m:val="p"/>
               </m:rPr>
-              <m:t>Pr</m:t>
+              <m:t>=</m:t>
+            </m:r>
+            <m:r>
+              <m:t>1</m:t>
             </m:r>
           </m:e>
-        </m:acc>
-        <m:r>
-          <m:rPr>
-            <m:sty m:val="p"/>
-          </m:rPr>
-          <m:t>[</m:t>
-        </m:r>
-        <m:sSup>
-          <m:e>
-            <m:r>
-              <m:t>Y</m:t>
-            </m:r>
-          </m:e>
-          <m:sup>
-            <m:r>
-              <m:t>a</m:t>
-            </m:r>
-          </m:sup>
-        </m:sSup>
-        <m:r>
-          <m:rPr>
-            <m:sty m:val="p"/>
-          </m:rPr>
-          <m:t>=</m:t>
-        </m:r>
-        <m:r>
-          <m:t>1</m:t>
-        </m:r>
-        <m:r>
-          <m:rPr>
-            <m:sty m:val="p"/>
-          </m:rPr>
-          <m:t>]</m:t>
+        </m:d>
+        <m:r>
+          <m:t>​</m:t>
         </m:r>
       </m:oMath>
       <w:r>
@@ -7891,10 +7977,12 @@
             <m:oMath>
               <m:r>
                 <m:rPr>
-                  <m:nor/>
                   <m:sty m:val="p"/>
                 </m:rPr>
                 <m:t>E</m:t>
+              </m:r>
+              <m:r>
+                <m:t>​</m:t>
               </m:r>
               <m:d>
                 <m:dPr>
@@ -7918,6 +8006,9 @@
                   </m:sSup>
                 </m:e>
               </m:d>
+              <m:r>
+                <m:t>​</m:t>
+              </m:r>
               <m:r>
                 <m:rPr>
                   <m:sty m:val="p"/>
@@ -8041,10 +8132,12 @@
               </m:r>
               <m:r>
                 <m:rPr>
-                  <m:nor/>
                   <m:sty m:val="p"/>
                 </m:rPr>
                 <m:t>E</m:t>
+              </m:r>
+              <m:r>
+                <m:t>​</m:t>
               </m:r>
               <m:d>
                 <m:dPr>
@@ -8095,6 +8188,9 @@
                   </m:r>
                 </m:e>
               </m:d>
+              <m:r>
+                <m:t>​</m:t>
+              </m:r>
             </m:oMath>
             <w:r>
               <w:t xml:space="preserve"> </w:t>
@@ -8349,10 +8445,12 @@
             <m:oMath>
               <m:r>
                 <m:rPr>
-                  <m:nor/>
                   <m:sty m:val="p"/>
                 </m:rPr>
                 <m:t>E</m:t>
+              </m:r>
+              <m:r>
+                <m:t>​</m:t>
               </m:r>
               <m:d>
                 <m:dPr>
@@ -8410,6 +8508,9 @@
                 </m:e>
               </m:d>
               <m:r>
+                <m:t>​</m:t>
+              </m:r>
+              <m:r>
                 <m:rPr>
                   <m:sty m:val="p"/>
                 </m:rPr>
@@ -8417,10 +8518,12 @@
               </m:r>
               <m:r>
                 <m:rPr>
-                  <m:nor/>
                   <m:sty m:val="p"/>
                 </m:rPr>
                 <m:t>E</m:t>
+              </m:r>
+              <m:r>
+                <m:t>​</m:t>
               </m:r>
               <m:d>
                 <m:dPr>
@@ -8477,6 +8580,9 @@
                   </m:r>
                 </m:e>
               </m:d>
+              <m:r>
+                <m:t>​</m:t>
+              </m:r>
             </m:oMath>
             <w:r>
               <w:t xml:space="preserve"> </w:t>
@@ -8490,10 +8596,12 @@
             <m:oMath>
               <m:r>
                 <m:rPr>
-                  <m:nor/>
                   <m:sty m:val="p"/>
                 </m:rPr>
                 <m:t>E</m:t>
+              </m:r>
+              <m:r>
+                <m:t>​</m:t>
               </m:r>
               <m:d>
                 <m:dPr>
@@ -8607,6 +8715,9 @@
                   </m:r>
                 </m:e>
               </m:d>
+              <m:r>
+                <m:t>​</m:t>
+              </m:r>
             </m:oMath>
             <w:r>
               <w:t xml:space="preserve"> </w:t>
@@ -8680,10 +8791,12 @@
               </m:r>
               <m:r>
                 <m:rPr>
-                  <m:nor/>
                   <m:sty m:val="p"/>
                 </m:rPr>
                 <m:t>E</m:t>
+              </m:r>
+              <m:r>
+                <m:t>​</m:t>
               </m:r>
               <m:d>
                 <m:dPr>
@@ -8740,6 +8853,9 @@
                   </m:r>
                 </m:e>
               </m:d>
+              <m:r>
+                <m:t>​</m:t>
+              </m:r>
             </m:oMath>
             <w:r>
               <w:t xml:space="preserve">, provided</w:t>
@@ -10216,10 +10332,12 @@
       <m:oMath>
         <m:r>
           <m:rPr>
-            <m:nor/>
             <m:sty m:val="p"/>
           </m:rPr>
           <m:t>E</m:t>
+        </m:r>
+        <m:r>
+          <m:t>​</m:t>
         </m:r>
         <m:d>
           <m:dPr>
@@ -10253,6 +10371,9 @@
           </m:e>
         </m:d>
         <m:r>
+          <m:t>​</m:t>
+        </m:r>
+        <m:r>
           <m:rPr>
             <m:sty m:val="p"/>
           </m:rPr>
@@ -10260,10 +10381,12 @@
         </m:r>
         <m:r>
           <m:rPr>
-            <m:nor/>
             <m:sty m:val="p"/>
           </m:rPr>
           <m:t>E</m:t>
+        </m:r>
+        <m:r>
+          <m:t>​</m:t>
         </m:r>
         <m:d>
           <m:dPr>
@@ -10296,6 +10419,9 @@
             </m:r>
           </m:e>
         </m:d>
+        <m:r>
+          <m:t>​</m:t>
+        </m:r>
       </m:oMath>
       <w:r>
         <w:t xml:space="preserve">;</w:t>
@@ -10318,10 +10444,12 @@
       <m:oMath>
         <m:r>
           <m:rPr>
-            <m:nor/>
             <m:sty m:val="p"/>
           </m:rPr>
           <m:t>E</m:t>
+        </m:r>
+        <m:r>
+          <m:t>​</m:t>
         </m:r>
         <m:d>
           <m:dPr>
@@ -10355,6 +10483,9 @@
           </m:e>
         </m:d>
         <m:r>
+          <m:t>​</m:t>
+        </m:r>
+        <m:r>
           <m:rPr>
             <m:sty m:val="p"/>
           </m:rPr>
@@ -10362,10 +10493,12 @@
         </m:r>
         <m:r>
           <m:rPr>
-            <m:nor/>
             <m:sty m:val="p"/>
           </m:rPr>
           <m:t>E</m:t>
+        </m:r>
+        <m:r>
+          <m:t>​</m:t>
         </m:r>
         <m:d>
           <m:dPr>
@@ -10398,6 +10531,9 @@
             </m:r>
           </m:e>
         </m:d>
+        <m:r>
+          <m:t>​</m:t>
+        </m:r>
       </m:oMath>
       <w:r>
         <w:t xml:space="preserve"> </w:t>
@@ -11388,10 +11524,12 @@
       <m:oMath>
         <m:r>
           <m:rPr>
-            <m:nor/>
             <m:sty m:val="p"/>
           </m:rPr>
           <m:t>E</m:t>
+        </m:r>
+        <m:r>
+          <m:t>​</m:t>
         </m:r>
         <m:d>
           <m:dPr>
@@ -11425,6 +11563,9 @@
           </m:e>
         </m:d>
         <m:r>
+          <m:t>​</m:t>
+        </m:r>
+        <m:r>
           <m:rPr>
             <m:sty m:val="p"/>
           </m:rPr>
@@ -11432,10 +11573,12 @@
         </m:r>
         <m:r>
           <m:rPr>
-            <m:nor/>
             <m:sty m:val="p"/>
           </m:rPr>
           <m:t>E</m:t>
+        </m:r>
+        <m:r>
+          <m:t>​</m:t>
         </m:r>
         <m:d>
           <m:dPr>
@@ -11469,6 +11612,9 @@
           </m:e>
         </m:d>
         <m:r>
+          <m:t>​</m:t>
+        </m:r>
+        <m:r>
           <m:rPr>
             <m:sty m:val="p"/>
           </m:rPr>
@@ -11476,10 +11622,12 @@
         </m:r>
         <m:r>
           <m:rPr>
-            <m:nor/>
             <m:sty m:val="p"/>
           </m:rPr>
           <m:t>E</m:t>
+        </m:r>
+        <m:r>
+          <m:t>​</m:t>
         </m:r>
         <m:d>
           <m:dPr>
@@ -11539,6 +11687,9 @@
             </m:sSup>
           </m:e>
         </m:d>
+        <m:r>
+          <m:t>​</m:t>
+        </m:r>
       </m:oMath>
       <w:r>
         <w:t xml:space="preserve"> </w:t>
@@ -11552,10 +11703,12 @@
       <m:oMath>
         <m:r>
           <m:rPr>
-            <m:nor/>
             <m:sty m:val="p"/>
           </m:rPr>
           <m:t>E</m:t>
+        </m:r>
+        <m:r>
+          <m:t>​</m:t>
         </m:r>
         <m:d>
           <m:dPr>
@@ -11589,6 +11742,9 @@
           </m:e>
         </m:d>
         <m:r>
+          <m:t>​</m:t>
+        </m:r>
+        <m:r>
           <m:rPr>
             <m:sty m:val="p"/>
           </m:rPr>
@@ -11596,10 +11752,12 @@
         </m:r>
         <m:r>
           <m:rPr>
-            <m:nor/>
             <m:sty m:val="p"/>
           </m:rPr>
           <m:t>E</m:t>
+        </m:r>
+        <m:r>
+          <m:t>​</m:t>
         </m:r>
         <m:d>
           <m:dPr>
@@ -11632,6 +11790,9 @@
             </m:sSup>
           </m:e>
         </m:d>
+        <m:r>
+          <m:t>​</m:t>
+        </m:r>
       </m:oMath>
       <w:r>
         <w:t xml:space="preserve">;</w:t>

</xml_diff>

<commit_message>
Deploying to gh-pages from @ Morrison-Lab/win@42258c89bb6edf734cdbea7b64578bc0c9613b65 🚀
</commit_message>
<xml_diff>
--- a/chapters/01-introduction.docx
+++ b/chapters/01-introduction.docx
@@ -2370,6 +2370,7 @@
             <m:oMath>
               <m:r>
                 <m:rPr>
+                  <m:scr m:val="double-struck"/>
                   <m:sty m:val="p"/>
                 </m:rPr>
                 <m:t>E</m:t>
@@ -2419,6 +2420,7 @@
               </m:r>
               <m:r>
                 <m:rPr>
+                  <m:scr m:val="double-struck"/>
                   <m:sty m:val="p"/>
                 </m:rPr>
                 <m:t>E</m:t>
@@ -2512,6 +2514,7 @@
       <m:oMath>
         <m:r>
           <m:rPr>
+            <m:scr m:val="double-struck"/>
             <m:sty m:val="p"/>
           </m:rPr>
           <m:t>E</m:t>
@@ -2561,6 +2564,7 @@
         </m:r>
         <m:r>
           <m:rPr>
+            <m:scr m:val="double-struck"/>
             <m:sty m:val="p"/>
           </m:rPr>
           <m:t>E</m:t>
@@ -3082,6 +3086,7 @@
         <m:oMath>
           <m:r>
             <m:rPr>
+              <m:scr m:val="double-struck"/>
               <m:sty m:val="p"/>
             </m:rPr>
             <m:t>E</m:t>
@@ -3131,6 +3136,7 @@
           </m:r>
           <m:r>
             <m:rPr>
+              <m:scr m:val="double-struck"/>
               <m:sty m:val="p"/>
             </m:rPr>
             <m:t>E</m:t>
@@ -3180,6 +3186,7 @@
           </m:r>
           <m:r>
             <m:rPr>
+              <m:scr m:val="double-struck"/>
               <m:sty m:val="p"/>
             </m:rPr>
             <m:t>E</m:t>
@@ -3997,6 +4004,7 @@
             <m:oMath>
               <m:r>
                 <m:rPr>
+                  <m:scr m:val="double-struck"/>
                   <m:sty m:val="p"/>
                 </m:rPr>
                 <m:t>E</m:t>
@@ -4065,6 +4073,7 @@
             <m:oMath>
               <m:r>
                 <m:rPr>
+                  <m:scr m:val="double-struck"/>
                   <m:sty m:val="p"/>
                 </m:rPr>
                 <m:t>E</m:t>
@@ -4273,6 +4282,7 @@
             <m:oMath>
               <m:r>
                 <m:rPr>
+                  <m:scr m:val="double-struck"/>
                   <m:sty m:val="p"/>
                 </m:rPr>
                 <m:t>E</m:t>
@@ -4372,6 +4382,7 @@
             <m:oMath>
               <m:r>
                 <m:rPr>
+                  <m:scr m:val="double-struck"/>
                   <m:sty m:val="p"/>
                 </m:rPr>
                 <m:t>E</m:t>
@@ -4486,6 +4497,7 @@
             <m:oMath>
               <m:r>
                 <m:rPr>
+                  <m:scr m:val="double-struck"/>
                   <m:sty m:val="p"/>
                 </m:rPr>
                 <m:t>E</m:t>
@@ -4645,6 +4657,7 @@
             <m:oMath>
               <m:r>
                 <m:rPr>
+                  <m:scr m:val="double-struck"/>
                   <m:sty m:val="p"/>
                 </m:rPr>
                 <m:t>E</m:t>
@@ -4685,6 +4698,7 @@
               </m:r>
               <m:r>
                 <m:rPr>
+                  <m:scr m:val="double-struck"/>
                   <m:sty m:val="p"/>
                 </m:rPr>
                 <m:t>E</m:t>
@@ -7977,6 +7991,7 @@
             <m:oMath>
               <m:r>
                 <m:rPr>
+                  <m:scr m:val="double-struck"/>
                   <m:sty m:val="p"/>
                 </m:rPr>
                 <m:t>E</m:t>
@@ -8132,6 +8147,7 @@
               </m:r>
               <m:r>
                 <m:rPr>
+                  <m:scr m:val="double-struck"/>
                   <m:sty m:val="p"/>
                 </m:rPr>
                 <m:t>E</m:t>
@@ -8445,6 +8461,7 @@
             <m:oMath>
               <m:r>
                 <m:rPr>
+                  <m:scr m:val="double-struck"/>
                   <m:sty m:val="p"/>
                 </m:rPr>
                 <m:t>E</m:t>
@@ -8518,6 +8535,7 @@
               </m:r>
               <m:r>
                 <m:rPr>
+                  <m:scr m:val="double-struck"/>
                   <m:sty m:val="p"/>
                 </m:rPr>
                 <m:t>E</m:t>
@@ -8596,6 +8614,7 @@
             <m:oMath>
               <m:r>
                 <m:rPr>
+                  <m:scr m:val="double-struck"/>
                   <m:sty m:val="p"/>
                 </m:rPr>
                 <m:t>E</m:t>
@@ -8791,6 +8810,7 @@
               </m:r>
               <m:r>
                 <m:rPr>
+                  <m:scr m:val="double-struck"/>
                   <m:sty m:val="p"/>
                 </m:rPr>
                 <m:t>E</m:t>
@@ -10332,6 +10352,7 @@
       <m:oMath>
         <m:r>
           <m:rPr>
+            <m:scr m:val="double-struck"/>
             <m:sty m:val="p"/>
           </m:rPr>
           <m:t>E</m:t>
@@ -10381,6 +10402,7 @@
         </m:r>
         <m:r>
           <m:rPr>
+            <m:scr m:val="double-struck"/>
             <m:sty m:val="p"/>
           </m:rPr>
           <m:t>E</m:t>
@@ -10444,6 +10466,7 @@
       <m:oMath>
         <m:r>
           <m:rPr>
+            <m:scr m:val="double-struck"/>
             <m:sty m:val="p"/>
           </m:rPr>
           <m:t>E</m:t>
@@ -10493,6 +10516,7 @@
         </m:r>
         <m:r>
           <m:rPr>
+            <m:scr m:val="double-struck"/>
             <m:sty m:val="p"/>
           </m:rPr>
           <m:t>E</m:t>
@@ -11524,6 +11548,7 @@
       <m:oMath>
         <m:r>
           <m:rPr>
+            <m:scr m:val="double-struck"/>
             <m:sty m:val="p"/>
           </m:rPr>
           <m:t>E</m:t>
@@ -11573,6 +11598,7 @@
         </m:r>
         <m:r>
           <m:rPr>
+            <m:scr m:val="double-struck"/>
             <m:sty m:val="p"/>
           </m:rPr>
           <m:t>E</m:t>
@@ -11622,6 +11648,7 @@
         </m:r>
         <m:r>
           <m:rPr>
+            <m:scr m:val="double-struck"/>
             <m:sty m:val="p"/>
           </m:rPr>
           <m:t>E</m:t>
@@ -11703,6 +11730,7 @@
       <m:oMath>
         <m:r>
           <m:rPr>
+            <m:scr m:val="double-struck"/>
             <m:sty m:val="p"/>
           </m:rPr>
           <m:t>E</m:t>
@@ -11752,6 +11780,7 @@
         </m:r>
         <m:r>
           <m:rPr>
+            <m:scr m:val="double-struck"/>
             <m:sty m:val="p"/>
           </m:rPr>
           <m:t>E</m:t>

</xml_diff>